<commit_message>
fix(document-factory): finalize APA layout and audit epistemology deliverables
</commit_message>
<xml_diff>
--- a/factory-runs/unit2-epistemologia/deliverables/Trabajo2_DiegoIgnacioNorambuenaMiranda.docx
+++ b/factory-runs/unit2-epistemologia/deliverables/Trabajo2_DiegoIgnacioNorambuenaMiranda.docx
@@ -24,7 +24,7 @@
                     <pic:cNvPicPr/>
                   </pic:nvPicPr>
                   <pic:blipFill>
-                    <a:blip r:embed="rId9"/>
+                    <a:blip r:embed="rId10"/>
                     <a:stretch>
                       <a:fillRect/>
                     </a:stretch>
@@ -200,7 +200,7 @@
           <w:rFonts w:ascii="Arial" w:hAnsi="Arial"/>
           <w:sz w:val="24"/>
         </w:rPr>
-        <w:t xml:space="preserve">Fuente del logotipo: Universidad UNIACC (2013), Wikimedia Commons; licencia CC BY-SA 4.0. https://commons.wikimedia.org/wiki/File:LOGO_UNIACC.png</w:t>
+        <w:t xml:space="preserve">Logotipo: Universidad UNIACC (2013), Wikimedia Commons. Licencia CC BY-SA 4.0: https://creativecommons.org/licenses/by-sa/4.0/. Archivo: https://commons.wikimedia.org/wiki/File:LOGO_UNIACC.png</w:t>
       </w:r>
     </w:p>
     <w:bookmarkStart w:id="9" w:name="_b45b0e0cc75c14e905d0f8fd45a0cb842ab4f3a"/>
@@ -642,7 +642,7 @@
           <w:rFonts w:ascii="Arial" w:hAnsi="Arial"/>
           <w:sz w:val="24"/>
         </w:rPr>
-        <w:t xml:space="preserve">(edición de otoño de 2022). Metaphysics Research Lab, Stanford University. https://plato.stanford.edu/archives/fall2022/entries/logical-empiricism/</w:t>
+        <w:t xml:space="preserve">(edición de verano de 2024). Metaphysics Research Lab, Stanford University. https://plato.stanford.edu/archives/sum2024/entries/logical-empiricism/</w:t>
       </w:r>
     </w:p>
     <w:p>
@@ -865,6 +865,7 @@
     </w:p>
     <w:bookmarkEnd w:id="13"/>
     <w:sectPr>
+      <w:headerReference w:type="default" r:id="rId9"/>
       <w:footnotePr>
         <w:numRestart w:val="eachSect"/>
       </w:footnotePr>
@@ -895,6 +896,29 @@
     </w:p>
   </w:footnote>
 </w:footnotes>
+</file>
+
+<file path=word/header1.xml><?xml version="1.0" encoding="utf-8"?>
+<w:hdr xmlns:m="http://schemas.openxmlformats.org/officeDocument/2006/math" xmlns:mc="http://schemas.openxmlformats.org/markup-compatibility/2006" xmlns:mo="http://schemas.microsoft.com/office/mac/office/2008/main" xmlns:mv="urn:schemas-microsoft-com:mac:vml" xmlns:o="urn:schemas-microsoft-com:office:office" xmlns:r="http://schemas.openxmlformats.org/officeDocument/2006/relationships" xmlns:v="urn:schemas-microsoft-com:vml" xmlns:w10="urn:schemas-microsoft-com:office:word" xmlns:w14="http://schemas.microsoft.com/office/word/2010/wordml" xmlns:w="http://schemas.openxmlformats.org/wordprocessingml/2006/main" xmlns:wne="http://schemas.microsoft.com/office/word/2006/wordml" xmlns:wp14="http://schemas.microsoft.com/office/word/2010/wordprocessingDrawing" xmlns:wp="http://schemas.openxmlformats.org/drawingml/2006/wordprocessingDrawing" xmlns:wpc="http://schemas.microsoft.com/office/word/2010/wordprocessingCanvas" xmlns:wpg="http://schemas.microsoft.com/office/word/2010/wordprocessingGroup" xmlns:wpi="http://schemas.microsoft.com/office/word/2010/wordprocessingInk" xmlns:wps="http://schemas.microsoft.com/office/word/2010/wordprocessingShape" mc:Ignorable="w14 wp14">
+  <w:p>
+    <w:pPr>
+      <w:pStyle w:val="Header"/>
+      <w:spacing w:after="0"/>
+      <w:jc w:val="right"/>
+    </w:pPr>
+    <w:r>
+      <w:rPr>
+        <w:rFonts w:ascii="Arial" w:hAnsi="Arial"/>
+        <w:sz w:val="24"/>
+      </w:rPr>
+      <w:fldChar w:fldCharType="begin"/>
+      <w:instrText xml:space="preserve"> PAGE </w:instrText>
+      <w:fldChar w:fldCharType="separate"/>
+      <w:t>1</w:t>
+      <w:fldChar w:fldCharType="end"/>
+    </w:r>
+  </w:p>
+</w:hdr>
 </file>
 
 <file path=word/numbering.xml><?xml version="1.0" encoding="utf-8"?>

</xml_diff>